<commit_message>
Update both backend developer resume in DOCX format and backend engineer resume in PDF format to the latest versions.
</commit_message>
<xml_diff>
--- a/public/Reazul_Islam_Reaz_Backend_Developer_Resume.docx
+++ b/public/Reazul_Islam_Reaz_Backend_Developer_Resume.docx
@@ -180,11 +180,9 @@
         <w:rPr>
           <w:rFonts w:ascii="Cambria" w:hAnsi="Cambria"/>
           <w:b w:val="0"/>
-          <w:i w:val="0"/>
-          <w:color w:val="000000"/>
           <w:sz w:val="22"/>
         </w:rPr>
-        <w:t>Developed and maintained RESTful APIs with Node.js, Express.js, and TypeScript for event and conference platforms.</w:t>
+        <w:t>Built and maintained scalable REST APIs handling X+ users for event platforms using Node.js, Express.js, and TypeScript.</w:t>
       </w:r>
     </w:p>
     <w:p>
@@ -196,11 +194,9 @@
         <w:rPr>
           <w:rFonts w:ascii="Cambria" w:hAnsi="Cambria"/>
           <w:b w:val="0"/>
-          <w:i w:val="0"/>
-          <w:color w:val="000000"/>
           <w:sz w:val="22"/>
         </w:rPr>
-        <w:t>Implemented RBAC across Admin, Organizer, Volunteer, Attendee, and Exhibitor roles with JWT-based auth and Socket.IO realtime.</w:t>
+        <w:t>Implemented RBAC system across 5+ user roles, improving access control and security.</w:t>
       </w:r>
     </w:p>
     <w:p>
@@ -212,11 +208,9 @@
         <w:rPr>
           <w:rFonts w:ascii="Cambria" w:hAnsi="Cambria"/>
           <w:b w:val="0"/>
-          <w:i w:val="0"/>
-          <w:color w:val="000000"/>
           <w:sz w:val="22"/>
         </w:rPr>
-        <w:t>Designed MongoDB/Mongoose schemas, QR check-in workflows, and layered Express services with Zod validation and standardized API responses.</w:t>
+        <w:t>Reduced API response time by X% through optimized MongoDB queries and indexing.</w:t>
       </w:r>
     </w:p>
     <w:p>

</xml_diff>